<commit_message>
Add reproducibility repository link to manuscript
</commit_message>
<xml_diff>
--- a/IDO1_TDO2_preprint_PACR_revised_clean.docx
+++ b/IDO1_TDO2_preprint_PACR_revised_clean.docx
@@ -4074,17 +4074,19 @@
         </w:rPr>
       </w:pPr>
       <w:r>
-        <w:rPr>
-          <w:rFonts w:ascii="Times New Roman" w:hAnsi="Times New Roman" w:cs="Times New Roman"/>
-        </w:rPr>
-        <w:t xml:space="preserve">All analysis used public ChEMBL bioactivity data and open-source tools (RDKit, scikit-learn, smina). Curated datasets, ranked candidate lists, trained models, docking outputs </w:t>
-      </w:r>
-      <w:r>
-        <w:rPr>
-          <w:rFonts w:ascii="Times New Roman" w:hAnsi="Times New Roman" w:cs="Times New Roman"/>
-        </w:rPr>
-        <w:lastRenderedPageBreak/>
-        <w:t>and figures are provided as supplementary artifacts. Framework outputs include the paired M/D dataset (data/paired_MD_dataset.csv), split-hardness and leave-document-out results (data/split_hardness.csv, data/lodo_results.csv), conformal calibration (data/conformal_calibration.csv), the conformal deck ranking (data/dual_conformal_ranked.csv), matched-pair transformations (data/mmp_transformations.csv) and the conformal M/D models with calibration residuals (models/md_conformal_models.joblib).</w:t>
+        <w:t xml:space="preserve">The version-controlled reproducibility repository is hosted at </w:t>
+      </w:r>
+      <w:hyperlink r:id="rId24">
+        <w:r>
+          <w:rPr>
+            <w:color w:val="0563C1"/>
+            <w:u w:val="single"/>
+          </w:rPr>
+          <w:t>https://github.com/PillowSoprano/IDO1-TDO2-Repurposing</w:t>
+        </w:r>
+      </w:hyperlink>
+      <w:r>
+        <w:t>. All analysis used public ChEMBL bioactivity data and open-source tools (RDKit, scikit-learn, smina). Curated datasets, ranked candidate lists, trained models, docking outputs and figures are provided as supplementary artifacts. Framework outputs include the paired M/D dataset (data/paired_MD_dataset.csv), split-hardness and leave-document-out results (data/split_hardness.csv, data/lodo_results.csv), conformal calibration (data/conformal_calibration.csv), the conformal deck ranking (data/dual_conformal_ranked.csv), matched-pair transformations (data/mmp_transformations.csv) and the conformal M/D models with calibration residuals (models/md_conformal_models.joblib).</w:t>
       </w:r>
     </w:p>
     <w:p>

</xml_diff>